<commit_message>
Added some libs to install in the esp-instruction
</commit_message>
<xml_diff>
--- a/docs/Короткие_инструкции/docx/A2_1_Загрузка_на_ESP32_прошивки.docx
+++ b/docs/Короткие_инструкции/docx/A2_1_Загрузка_на_ESP32_прошивки.docx
@@ -115,8 +115,6 @@
         </w:rPr>
         <w:t>Необходимые условия</w:t>
       </w:r>
-      <w:bookmarkStart w:id="17" w:name="_GoBack"/>
-      <w:bookmarkEnd w:id="17"/>
     </w:p>
     <w:p>
       <w:pPr>
@@ -463,10 +461,10 @@
           <w:lang w:val="ru-RU"/>
         </w:rPr>
       </w:pPr>
-      <w:bookmarkStart w:id="0" w:name="_Toc245531148"/>
-      <w:bookmarkStart w:id="1" w:name="_Toc632"/>
-      <w:bookmarkStart w:id="2" w:name="_Toc537"/>
-      <w:bookmarkStart w:id="3" w:name="_Toc737251953"/>
+      <w:bookmarkStart w:id="0" w:name="_Toc632"/>
+      <w:bookmarkStart w:id="1" w:name="_Toc245531148"/>
+      <w:bookmarkStart w:id="2" w:name="_Toc737251953"/>
+      <w:bookmarkStart w:id="3" w:name="_Toc537"/>
       <w:r>
         <w:rPr>
           <w:rFonts w:hint="default"/>
@@ -1521,10 +1519,10 @@
           <w:lang w:val="ru-RU"/>
         </w:rPr>
       </w:pPr>
-      <w:bookmarkStart w:id="4" w:name="_Toc1168675054"/>
-      <w:bookmarkStart w:id="5" w:name="_Toc31695"/>
-      <w:bookmarkStart w:id="6" w:name="_Toc1292543685"/>
-      <w:bookmarkStart w:id="7" w:name="_Toc14805"/>
+      <w:bookmarkStart w:id="4" w:name="_Toc31695"/>
+      <w:bookmarkStart w:id="5" w:name="_Toc14805"/>
+      <w:bookmarkStart w:id="6" w:name="_Toc1168675054"/>
+      <w:bookmarkStart w:id="7" w:name="_Toc1292543685"/>
       <w:r>
         <w:rPr>
           <w:rFonts w:hint="default"/>
@@ -1589,6 +1587,8 @@
       <w:r>
         <w:rPr>
           <w:rFonts w:hint="default"/>
+          <w:b/>
+          <w:bCs/>
           <w:lang w:val="en-US"/>
         </w:rPr>
         <w:t>GyverPID</w:t>
@@ -1681,15 +1681,26 @@
         <w:ind w:left="420" w:leftChars="0" w:hanging="420" w:firstLineChars="0"/>
         <w:rPr>
           <w:rFonts w:hint="default"/>
-          <w:lang w:val="en-US"/>
-        </w:rPr>
-      </w:pPr>
-      <w:r>
-        <w:rPr>
-          <w:rFonts w:hint="default"/>
-          <w:lang w:val="en-US"/>
-        </w:rPr>
-        <w:t xml:space="preserve">Adafruit PWM Servo Driver Library </w:t>
+          <w:b/>
+          <w:bCs/>
+          <w:lang w:val="en-US"/>
+        </w:rPr>
+      </w:pPr>
+      <w:r>
+        <w:rPr>
+          <w:rFonts w:hint="default"/>
+          <w:b/>
+          <w:bCs/>
+          <w:lang w:val="en-US"/>
+        </w:rPr>
+        <w:t>Adafruit PWM Servo Driver Library</w:t>
+      </w:r>
+      <w:r>
+        <w:rPr>
+          <w:rFonts w:hint="default"/>
+          <w:lang w:val="en-US"/>
+        </w:rPr>
+        <w:t xml:space="preserve"> </w:t>
       </w:r>
       <w:r>
         <w:rPr>
@@ -1767,7 +1778,246 @@
           <w:rFonts w:hint="default"/>
           <w:lang w:val="ru-RU"/>
         </w:rPr>
-        <w:t xml:space="preserve"> ).</w:t>
+        <w:t xml:space="preserve"> )</w:t>
+      </w:r>
+      <w:r>
+        <w:rPr>
+          <w:rFonts w:hint="default"/>
+          <w:lang w:val="en-US"/>
+        </w:rPr>
+        <w:t>;</w:t>
+      </w:r>
+    </w:p>
+    <w:p>
+      <w:pPr>
+        <w:numPr>
+          <w:ilvl w:val="0"/>
+          <w:numId w:val="4"/>
+        </w:numPr>
+        <w:ind w:left="420" w:leftChars="0" w:hanging="420" w:firstLineChars="0"/>
+        <w:rPr>
+          <w:rFonts w:hint="default"/>
+          <w:b w:val="0"/>
+          <w:bCs w:val="0"/>
+          <w:lang w:val="en-US"/>
+        </w:rPr>
+      </w:pPr>
+      <w:r>
+        <w:rPr>
+          <w:rFonts w:hint="default"/>
+          <w:b/>
+          <w:bCs/>
+          <w:lang w:val="en-US"/>
+        </w:rPr>
+        <w:t xml:space="preserve">GyverOLED </w:t>
+      </w:r>
+      <w:r>
+        <w:rPr>
+          <w:rFonts w:hint="default"/>
+          <w:lang w:val="ru-RU"/>
+        </w:rPr>
+        <w:t xml:space="preserve">(на момент написания последняя доступная версия </w:t>
+      </w:r>
+      <w:r>
+        <w:rPr>
+          <w:rFonts w:hint="default"/>
+          <w:lang w:val="en-US"/>
+        </w:rPr>
+        <w:t>1.6.4</w:t>
+      </w:r>
+      <w:r>
+        <w:rPr>
+          <w:rFonts w:hint="default"/>
+          <w:lang w:val="ru-RU"/>
+        </w:rPr>
+        <w:t>)</w:t>
+      </w:r>
+      <w:r>
+        <w:rPr>
+          <w:rFonts w:hint="default"/>
+          <w:lang w:val="en-US"/>
+        </w:rPr>
+        <w:t>(</w:t>
+      </w:r>
+      <w:r>
+        <w:rPr>
+          <w:rFonts w:hint="default"/>
+          <w:lang w:val="ru-RU"/>
+        </w:rPr>
+        <w:t xml:space="preserve">подробнее про функционал библиотеки можно прочитать здесь </w:t>
+      </w:r>
+      <w:r>
+        <w:rPr>
+          <w:rFonts w:hint="default"/>
+          <w:lang w:val="ru-RU"/>
+        </w:rPr>
+        <w:fldChar w:fldCharType="begin"/>
+      </w:r>
+      <w:r>
+        <w:rPr>
+          <w:rFonts w:hint="default"/>
+          <w:lang w:val="ru-RU"/>
+        </w:rPr>
+        <w:instrText xml:space="preserve"> HYPERLINK "https://github.com/GyverLibs/GyverOLED" </w:instrText>
+      </w:r>
+      <w:r>
+        <w:rPr>
+          <w:rFonts w:hint="default"/>
+          <w:lang w:val="ru-RU"/>
+        </w:rPr>
+        <w:fldChar w:fldCharType="separate"/>
+      </w:r>
+      <w:r>
+        <w:rPr>
+          <w:rStyle w:val="14"/>
+          <w:rFonts w:hint="default"/>
+          <w:lang w:val="ru-RU"/>
+        </w:rPr>
+        <w:t>https://github.com/GyverLibs/GyverOLED</w:t>
+      </w:r>
+      <w:r>
+        <w:rPr>
+          <w:rFonts w:hint="default"/>
+          <w:lang w:val="ru-RU"/>
+        </w:rPr>
+        <w:fldChar w:fldCharType="end"/>
+      </w:r>
+      <w:r>
+        <w:rPr>
+          <w:rFonts w:hint="default"/>
+          <w:lang w:val="en-US"/>
+        </w:rPr>
+        <w:t xml:space="preserve"> </w:t>
+      </w:r>
+      <w:r>
+        <w:rPr>
+          <w:rFonts w:hint="default"/>
+          <w:lang w:val="ru-RU"/>
+        </w:rPr>
+        <w:t>)</w:t>
+      </w:r>
+      <w:r>
+        <w:rPr>
+          <w:rFonts w:hint="default"/>
+          <w:lang w:val="en-US"/>
+        </w:rPr>
+        <w:t>;</w:t>
+      </w:r>
+    </w:p>
+    <w:p>
+      <w:pPr>
+        <w:numPr>
+          <w:ilvl w:val="0"/>
+          <w:numId w:val="4"/>
+        </w:numPr>
+        <w:ind w:left="420" w:leftChars="0" w:hanging="420" w:firstLineChars="0"/>
+        <w:rPr>
+          <w:rFonts w:hint="default"/>
+          <w:b w:val="0"/>
+          <w:bCs w:val="0"/>
+          <w:lang w:val="en-US"/>
+        </w:rPr>
+      </w:pPr>
+      <w:r>
+        <w:rPr>
+          <w:rFonts w:hint="default"/>
+          <w:b/>
+          <w:bCs/>
+          <w:lang w:val="en-US"/>
+        </w:rPr>
+        <w:t xml:space="preserve">INA219 </w:t>
+      </w:r>
+      <w:r>
+        <w:rPr>
+          <w:rFonts w:hint="default"/>
+          <w:lang w:val="ru-RU"/>
+        </w:rPr>
+        <w:t xml:space="preserve">(на момент написания последняя доступная версия </w:t>
+      </w:r>
+      <w:r>
+        <w:rPr>
+          <w:rFonts w:hint="default"/>
+          <w:lang w:val="en-US"/>
+        </w:rPr>
+        <w:t>0.4.2</w:t>
+      </w:r>
+      <w:r>
+        <w:rPr>
+          <w:rFonts w:hint="default"/>
+          <w:lang w:val="ru-RU"/>
+        </w:rPr>
+        <w:t>)</w:t>
+      </w:r>
+      <w:r>
+        <w:rPr>
+          <w:rFonts w:hint="default"/>
+          <w:lang w:val="en-US"/>
+        </w:rPr>
+        <w:t>(</w:t>
+      </w:r>
+      <w:r>
+        <w:rPr>
+          <w:rFonts w:hint="default"/>
+          <w:lang w:val="ru-RU"/>
+        </w:rPr>
+        <w:t xml:space="preserve">подробнее про функционал библиотеки можно прочитать здесь </w:t>
+      </w:r>
+      <w:r>
+        <w:rPr>
+          <w:rFonts w:hint="default"/>
+          <w:lang w:val="ru-RU"/>
+        </w:rPr>
+        <w:fldChar w:fldCharType="begin"/>
+      </w:r>
+      <w:r>
+        <w:rPr>
+          <w:rFonts w:hint="default"/>
+          <w:lang w:val="ru-RU"/>
+        </w:rPr>
+        <w:instrText xml:space="preserve"> HYPERLINK "https://github.com/RobTillaart/INA219" </w:instrText>
+      </w:r>
+      <w:r>
+        <w:rPr>
+          <w:rFonts w:hint="default"/>
+          <w:lang w:val="ru-RU"/>
+        </w:rPr>
+        <w:fldChar w:fldCharType="separate"/>
+      </w:r>
+      <w:r>
+        <w:rPr>
+          <w:rStyle w:val="14"/>
+          <w:rFonts w:hint="default"/>
+          <w:lang w:val="ru-RU"/>
+        </w:rPr>
+        <w:t>https://github.com/RobTillaart/INA219</w:t>
+      </w:r>
+      <w:r>
+        <w:rPr>
+          <w:rFonts w:hint="default"/>
+          <w:lang w:val="ru-RU"/>
+        </w:rPr>
+        <w:fldChar w:fldCharType="end"/>
+      </w:r>
+      <w:r>
+        <w:rPr>
+          <w:rFonts w:hint="default"/>
+          <w:lang w:val="en-US"/>
+        </w:rPr>
+        <w:t xml:space="preserve"> </w:t>
+      </w:r>
+      <w:r>
+        <w:rPr>
+          <w:rFonts w:hint="default"/>
+          <w:lang w:val="ru-RU"/>
+        </w:rPr>
+        <w:t>)</w:t>
+      </w:r>
+      <w:r>
+        <w:rPr>
+          <w:rFonts w:hint="default"/>
+          <w:lang w:val="en-US"/>
+        </w:rPr>
+        <w:t>.</w:t>
       </w:r>
     </w:p>
     <w:p>
@@ -2297,7 +2547,7 @@
           <wp:inline distT="0" distB="0" distL="114300" distR="114300">
             <wp:extent cx="5270500" cy="3573780"/>
             <wp:effectExtent l="0" t="0" r="0" b="0"/>
-            <wp:docPr id="6" name="Picture 5"/>
+            <wp:docPr id="17" name="Picture 1"/>
             <wp:cNvGraphicFramePr>
               <a:graphicFrameLocks xmlns:a="http://schemas.openxmlformats.org/drawingml/2006/main" noChangeAspect="1"/>
             </wp:cNvGraphicFramePr>
@@ -2305,7 +2555,7 @@
               <a:graphicData uri="http://schemas.openxmlformats.org/drawingml/2006/picture">
                 <pic:pic xmlns:pic="http://schemas.openxmlformats.org/drawingml/2006/picture">
                   <pic:nvPicPr>
-                    <pic:cNvPr id="6" name="Picture 5"/>
+                    <pic:cNvPr id="17" name="Picture 1"/>
                     <pic:cNvPicPr>
                       <a:picLocks noChangeAspect="1"/>
                     </pic:cNvPicPr>
@@ -2335,6 +2585,8 @@
           </wp:inline>
         </w:drawing>
       </w:r>
+      <w:bookmarkStart w:id="17" w:name="_GoBack"/>
+      <w:bookmarkEnd w:id="17"/>
     </w:p>
     <w:p>
       <w:pPr>
@@ -2656,10 +2908,10 @@
           <w:lang w:val="ru-RU"/>
         </w:rPr>
       </w:pPr>
-      <w:bookmarkStart w:id="8" w:name="_Toc127156634"/>
+      <w:bookmarkStart w:id="8" w:name="_Toc28470"/>
       <w:bookmarkStart w:id="9" w:name="_Toc1700829849"/>
       <w:bookmarkStart w:id="10" w:name="_Toc1087"/>
-      <w:bookmarkStart w:id="11" w:name="_Toc28470"/>
+      <w:bookmarkStart w:id="11" w:name="_Toc127156634"/>
       <w:r>
         <w:rPr>
           <w:rFonts w:hint="default"/>
@@ -3971,10 +4223,10 @@
           <w:lang w:val="ru-RU"/>
         </w:rPr>
       </w:pPr>
-      <w:bookmarkStart w:id="12" w:name="_Toc11247"/>
-      <w:bookmarkStart w:id="13" w:name="_Toc1714107064"/>
-      <w:bookmarkStart w:id="14" w:name="_Toc847700259"/>
-      <w:bookmarkStart w:id="15" w:name="_Toc11795"/>
+      <w:bookmarkStart w:id="12" w:name="_Toc1714107064"/>
+      <w:bookmarkStart w:id="13" w:name="_Toc11795"/>
+      <w:bookmarkStart w:id="14" w:name="_Toc11247"/>
+      <w:bookmarkStart w:id="15" w:name="_Toc847700259"/>
       <w:r>
         <w:rPr>
           <w:rFonts w:hint="default"/>

</xml_diff>